<commit_message>
Verify all citations against primary sources; pin articles and dates
- Appendix now cites primary instruments with exact articles/dates: I&R Dir
  2003/49 art 3 + 1(10); FDI Reg 2019/452; defence transfers Dir 2009/43 art 10;
  PSD 2011/96; Pillar Two 2022/2523; UK-Bulgaria DTC (SI 2015/1891) art 10;
  CTA 2009 Pt 9A ss931A-931W; TCGA 1992 Sch 7AC; LIR arts 166/147/50ter;
  Bulgaria CITA art 20; Bulgaria IPA (SG 20/08.03.2024, in force 12.03.2024;
  rules SG 59/22.07.2025); Czech Act 34/2021 (in force 01.05.2021)
- 7.5/7.6 wording tightened with these references
- Next steps reframed for fundraising stage (consultation once investors set;
  local-counsel opinions after structure agreed)
- Both PDF and DOCX regenerated in sync

https://claude.ai/code/session_01JTbBsiSWXRS1fuAGFXnjiU
</commit_message>
<xml_diff>
--- a/STRIKER_Structure_Memorandum_RU.docx
+++ b/STRIKER_Structure_Memorandum_RU.docx
@@ -265,6 +265,17 @@
     </w:p>
     <w:p>
       <w:pPr>
+        <w:spacing w:after="100"/>
+      </w:pPr>
+      <w:r>
+        <w:rPr>
+          <w:sz w:val="21"/>
+        </w:rPr>
+        <w:t>Проект находится на стадии привлечения инвесторов, поэтому шаги, зависящие от состава собственников, выполняются по мере его формирования.</w:t>
+      </w:r>
+    </w:p>
+    <w:p>
+      <w:pPr>
         <w:pStyle w:val="ListBullet"/>
         <w:spacing w:after="60"/>
       </w:pPr>
@@ -272,7 +283,7 @@
         <w:rPr>
           <w:sz w:val="20"/>
         </w:rPr>
-        <w:t>Провести предварительную консультацию с болгарским регулятором о допустимых условиях иностранного владения и о выдаче лицензии.</w:t>
+        <w:t>По мере формирования пула инвесторов — предварительная консультация с болгарским регулятором о допустимых условиях иностранного владения и о выдаче лицензии.</w:t>
       </w:r>
     </w:p>
     <w:p>
@@ -284,7 +295,7 @@
         <w:rPr>
           <w:sz w:val="20"/>
         </w:rPr>
-        <w:t>Согласовать с чешским и болгарским регуляторами порядок экспортного лицензирования.</w:t>
+        <w:t>Согласование с чешским и болгарским регуляторами порядка экспортного лицензирования (не зависит от состава инвесторов и может начаться раньше).</w:t>
       </w:r>
     </w:p>
     <w:p>
@@ -296,7 +307,7 @@
         <w:rPr>
           <w:sz w:val="20"/>
         </w:rPr>
-        <w:t>Подготовить акционерное соглашение на условиях раздела 9 и уточнить окончательный состав инвесторов.</w:t>
+        <w:t>Подготовка акционерного соглашения на условиях раздела 9.</w:t>
       </w:r>
     </w:p>
     <w:p>
@@ -308,7 +319,7 @@
         <w:rPr>
           <w:sz w:val="20"/>
         </w:rPr>
-        <w:t>Получить подтверждающие заключения местных юристов по Великобритании, Болгарии и Чехии на этапе внедрения.</w:t>
+        <w:t>После согласования структуры — подтверждающие заключения местных юристов по Великобритании, Болгарии и Чехии.</w:t>
       </w:r>
     </w:p>
     <w:p>
@@ -3596,7 +3607,7 @@
         <w:rPr>
           <w:sz w:val="20"/>
         </w:rPr>
-        <w:t>Болгария — основная страна проверки. Режим введён поправками в Закон о поощрении инвестиций и полностью действует с 22 июля 2025 года. Проверка применяется при приобретении доли от 10% или инвестиции свыше 2 млн €. Если в капитале инвестора значимо участвует государственный орган страны вне ЕС (это типично для суверенных фондов Залива), проверка обязательна независимо от суммы. Межведомственный совет выносит решение в срок до 45 рабочих дней.</w:t>
+        <w:t>Болгария — основная страна проверки. Режим введён поправками в Закон о поощрении инвестиций (в силе с 12 марта 2024 года; правила применения действуют с 22 июля 2025 года). Проверка применяется при приобретении доли от 10% или инвестиции свыше 2 млн €. Если в капитале инвестора значимо участвует государственный орган страны вне ЕС (это типично для суверенных фондов Залива), проверка обязательна независимо от суммы. Межведомственный совет выносит решение в срок до 45 рабочих дней.</w:t>
       </w:r>
     </w:p>
     <w:p>
@@ -3745,7 +3756,7 @@
         <w:rPr>
           <w:sz w:val="21"/>
         </w:rPr>
-        <w:t>Размещение лицензии в болгарской продающей компании не решает вопрос автоматически. По правилам Европейского союза о передаче оборонной продукции внутри ЕС (Директива 2009/43/ЕС) перемещение товара между странами союза не отменяет права государства контролировать его вывоз за пределы ЕС: при последующем экспорте получатель обязан соблюсти экспортные ограничения страны происхождения и при необходимости получить её согласие. Поскольку на первом этапе самолёт собирается и отгружается из Чехии, чешские правила и согласие применяются и при продаже через Болгарию. Конкретный порядок лицензирования следует согласовать с чешским и болгарским регуляторами до заключения контрактов.</w:t>
+        <w:t>Размещение лицензии в болгарской продающей компании не решает вопрос автоматически. По правилам Европейского союза о передаче оборонной продукции внутри ЕС (Директива 2009/43/ЕС, статья 10) перемещение товара между странами союза не отменяет права государства контролировать его вывоз за пределы ЕС: при последующем экспорте получатель обязан соблюсти экспортные ограничения страны происхождения и при необходимости получить её согласие. Поскольку на первом этапе самолёт собирается и отгружается из Чехии, чешские правила и согласие применяются и при продаже через Болгарию. Конкретный порядок лицензирования следует согласовать с чешским и болгарским регуляторами до заключения контрактов.</w:t>
       </w:r>
     </w:p>
     <w:p>
@@ -4334,7 +4345,7 @@
         <w:rPr>
           <w:sz w:val="21"/>
         </w:rPr>
-        <w:t>Ниже перечислены ключевые правовые акты, на которых основаны выводы меморандума. При внедрении структуры они подлежат подтверждению местными консультантами.</w:t>
+        <w:t>Ниже перечислены первичные правовые акты с указанием конкретных статей, на которых основаны выводы меморандума. Они сверены по официальным текстам; при согласовании структуры подлежат подтверждению местными юристами.</w:t>
       </w:r>
     </w:p>
     <w:tbl>
@@ -4405,7 +4416,7 @@
               <w:rPr>
                 <w:sz w:val="17"/>
               </w:rPr>
-              <w:t>Директива Совета 2011/96/ЕС (о материнских и дочерних компаниях)</w:t>
+              <w:t>Директива Совета 2011/96/ЕС от 30.11.2011 (материнские и дочерние компании)</w:t>
             </w:r>
           </w:p>
         </w:tc>
@@ -4433,7 +4444,7 @@
               <w:rPr>
                 <w:sz w:val="17"/>
               </w:rPr>
-              <w:t>Директива Совета 2003/49/ЕС (о процентах и роялти)</w:t>
+              <w:t>Директива Совета 2003/49/ЕС от 03.06.2003: статья 3 (порог 25%), статья 1(10) (срок до 2 лет — на усмотрение государства)</w:t>
             </w:r>
           </w:p>
         </w:tc>
@@ -4461,7 +4472,7 @@
               <w:rPr>
                 <w:sz w:val="17"/>
               </w:rPr>
-              <w:t>Директива Совета (ЕС) 2022/2523</w:t>
+              <w:t>Директива Совета (ЕС) 2022/2523 от 14.12.2022 (порог 750 млн €)</w:t>
             </w:r>
           </w:p>
         </w:tc>
@@ -4489,7 +4500,7 @@
               <w:rPr>
                 <w:sz w:val="17"/>
               </w:rPr>
-              <w:t>Соглашение об избежании двойного налогообложения 2015 года, статья 10</w:t>
+              <w:t>Соглашение об избежании двойного налогообложения 2015 года (в Великобритании — SI 2015/1891), статья 10</w:t>
             </w:r>
           </w:p>
         </w:tc>
@@ -4517,7 +4528,7 @@
               <w:rPr>
                 <w:sz w:val="17"/>
               </w:rPr>
-              <w:t>Закон о корпоративном налоге 2009 года, часть 9A</w:t>
+              <w:t>Закон о корпоративном налоге 2009 года, часть 9A (§§ 931A–931W)</w:t>
             </w:r>
           </w:p>
         </w:tc>
@@ -4573,7 +4584,7 @@
               <w:rPr>
                 <w:sz w:val="17"/>
               </w:rPr>
-              <w:t>Закон о подоходном налоге, статьи 147 и 166</w:t>
+              <w:t>Закон о подоходном налоге (LIR): статья 166 (дивиденды и прирост), статья 147 (освобождение удержания)</w:t>
             </w:r>
           </w:p>
         </w:tc>
@@ -4601,7 +4612,7 @@
               <w:rPr>
                 <w:sz w:val="17"/>
               </w:rPr>
-              <w:t>Закон о подоходном налоге, статья 50ter</w:t>
+              <w:t>Закон о подоходном налоге (LIR), статья 50ter (освобождение 80%)</w:t>
             </w:r>
           </w:p>
         </w:tc>
@@ -4629,7 +4640,7 @@
               <w:rPr>
                 <w:sz w:val="17"/>
               </w:rPr>
-              <w:t>Закон о корпоративном подоходном налоге (ставка 10%)</w:t>
+              <w:t>Закон о корпоративном подоходном налоге (ЗКПО), статья 20 — 10%</w:t>
             </w:r>
           </w:p>
         </w:tc>
@@ -4657,7 +4668,7 @@
               <w:rPr>
                 <w:sz w:val="17"/>
               </w:rPr>
-              <w:t>Регламент (ЕС) 2019/452</w:t>
+              <w:t>Регламент (ЕС) 2019/452 от 19.03.2019</w:t>
             </w:r>
           </w:p>
         </w:tc>
@@ -4685,7 +4696,7 @@
               <w:rPr>
                 <w:sz w:val="17"/>
               </w:rPr>
-              <w:t>Закон о поощрении инвестиций (действует с 22.07.2025)</w:t>
+              <w:t>Закон о поощрении инвестиций (поправки — Гос. вестник № 20 от 08.03.2024, в силе с 12.03.2024; правила применения — № 59 от 22.07.2025)</w:t>
             </w:r>
           </w:p>
         </w:tc>
@@ -4713,7 +4724,7 @@
               <w:rPr>
                 <w:sz w:val="17"/>
               </w:rPr>
-              <w:t>Закон № 34/2021 о проверке иностранных инвестиций</w:t>
+              <w:t>Закон № 34/2021 Coll. о проверке иностранных инвестиций (в силе с 01.05.2021)</w:t>
             </w:r>
           </w:p>
         </w:tc>
@@ -4741,7 +4752,7 @@
               <w:rPr>
                 <w:sz w:val="17"/>
               </w:rPr>
-              <w:t>Директива 2009/43/ЕС</w:t>
+              <w:t>Директива 2009/43/ЕС от 06.05.2009, статья 10 (экспортные ограничения)</w:t>
             </w:r>
           </w:p>
         </w:tc>

</xml_diff>

<commit_message>
Add section 2.5 Investment protection (law + BITs); drop fundraising-stage wording
- New 2.5: national-law protection (UK ECHR P1A1 / Lux EU Charter Art 17, free
  movement of capital) and investment treaties — UK-Bulgaria BIT (1995, in force)
  and UK-Czech BIT (1990) give the UK holding expropriation protection + ISDS;
  Lux intra-EU BITs terminated (2020 agreement post-Achmea). Notes EC challenge
  to UK BITs (CJEU referral Dec 2024), UK-Poland BIT terminated 2018, ICSID/NY
  Convention enforceability. Reinforces UK recommendation.
- Added matching key-advantage bullet, 2.3 pointer, and 4 appendix source rows
- Removed fundraising-stage phrasing from Next Steps (both PDF and DOCX)

https://claude.ai/code/session_01JTbBsiSWXRS1fuAGFXnjiU
</commit_message>
<xml_diff>
--- a/STRIKER_Structure_Memorandum_RU.docx
+++ b/STRIKER_Structure_Memorandum_RU.docx
@@ -265,17 +265,6 @@
     </w:p>
     <w:p>
       <w:pPr>
-        <w:spacing w:after="100"/>
-      </w:pPr>
-      <w:r>
-        <w:rPr>
-          <w:sz w:val="21"/>
-        </w:rPr>
-        <w:t>Проект находится на стадии привлечения инвесторов, поэтому шаги, зависящие от состава собственников, выполняются по мере его формирования.</w:t>
-      </w:r>
-    </w:p>
-    <w:p>
-      <w:pPr>
         <w:pStyle w:val="ListBullet"/>
         <w:spacing w:after="60"/>
       </w:pPr>
@@ -283,7 +272,7 @@
         <w:rPr>
           <w:sz w:val="20"/>
         </w:rPr>
-        <w:t>По мере формирования пула инвесторов — предварительная консультация с болгарским регулятором о допустимых условиях иностранного владения и о выдаче лицензии.</w:t>
+        <w:t>Предварительная консультация с болгарским регулятором о допустимых условиях иностранного владения и о выдаче лицензии.</w:t>
       </w:r>
     </w:p>
     <w:p>
@@ -295,7 +284,7 @@
         <w:rPr>
           <w:sz w:val="20"/>
         </w:rPr>
-        <w:t>Согласование с чешским и болгарским регуляторами порядка экспортного лицензирования (не зависит от состава инвесторов и может начаться раньше).</w:t>
+        <w:t>Согласование с чешским и болгарским регуляторами порядка экспортного лицензирования.</w:t>
       </w:r>
     </w:p>
     <w:p>
@@ -319,7 +308,7 @@
         <w:rPr>
           <w:sz w:val="20"/>
         </w:rPr>
-        <w:t>После согласования структуры — подтверждающие заключения местных юристов по Великобритании, Болгарии и Чехии.</w:t>
+        <w:t>Подтверждающие заключения местных юристов по Великобритании, Болгарии и Чехии.</w:t>
       </w:r>
     </w:p>
     <w:p>
@@ -625,6 +614,18 @@
           <w:sz w:val="20"/>
         </w:rPr>
         <w:t>Соответствие военно-экспортным требованиям. Болгария и Чехия — члены НАТО и ЕС с полноценными режимами лицензирования.</w:t>
+      </w:r>
+    </w:p>
+    <w:p>
+      <w:pPr>
+        <w:pStyle w:val="ListBullet"/>
+        <w:spacing w:after="60"/>
+      </w:pPr>
+      <w:r>
+        <w:rPr>
+          <w:sz w:val="20"/>
+        </w:rPr>
+        <w:t>Защита инвестиций. Британский холдинг пользуется действующим договором о защите инвестиций с Болгарией: гарантии от экспроприации и доступ к международному арбитражу против государства (подробнее — раздел 2.5).</w:t>
       </w:r>
     </w:p>
     <w:p>
@@ -1486,7 +1487,7 @@
         <w:rPr>
           <w:sz w:val="21"/>
         </w:rPr>
-        <w:t>Люксембург остаётся равноценной альтернативой, если инвесторы — преимущественно компании Евросоюза, нормально облагаемые налогом, и важны членство в ЕС, автоматическое освобождение прибыли и репутация для фондов. Выбор страны холдинга при этом не снимает проверку иностранных инвестиций: она оценивает конечного собственника независимо от того, где зарегистрирован холдинг (раздел 7.5).</w:t>
+        <w:t>Люксембург остаётся равноценной альтернативой, если инвесторы — преимущественно компании Евросоюза, нормально облагаемые налогом, и важны членство в ЕС, автоматическое освобождение прибыли и репутация для фондов. Выбор страны холдинга при этом не снимает проверку иностранных инвестиций: она оценивает конечного собственника независимо от того, где зарегистрирован холдинг (раздел 7.5). Великобритания даёт и дополнительный слой защиты инвестиций — через действующий инвестиционный договор с Болгарией (раздел 2.5).</w:t>
       </w:r>
     </w:p>
     <w:p>
@@ -1511,6 +1512,74 @@
           <w:sz w:val="21"/>
         </w:rPr>
         <w:t>Швейцария привлекательна по налогам и репутации, но для оборонного проекта с экспортной составляющей не подходит. Законы о военных материалах и о нейтралитете жёстко ограничивают участие швейцарских компаний в поставках военной продукции и её реэкспорте, что создаёт риск блокировки поставок и финансирования.</w:t>
+      </w:r>
+    </w:p>
+    <w:p>
+      <w:pPr>
+        <w:spacing w:before="160" w:after="40"/>
+      </w:pPr>
+      <w:r>
+        <w:rPr>
+          <w:b/>
+          <w:color w:val="142647"/>
+          <w:sz w:val="22"/>
+        </w:rPr>
+        <w:t>2.5 Защита инвестиций: национальное право и инвестиционные договоры</w:t>
+      </w:r>
+    </w:p>
+    <w:p>
+      <w:pPr>
+        <w:spacing w:after="100"/>
+      </w:pPr>
+      <w:r>
+        <w:rPr>
+          <w:sz w:val="21"/>
+        </w:rPr>
+        <w:t>Вложения инвесторов защищены на двух уровнях: правом страны холдинга и международными договорами о защите инвестиций между страной холдинга и государствами, где находятся активы проекта.</w:t>
+      </w:r>
+    </w:p>
+    <w:p>
+      <w:pPr>
+        <w:spacing w:after="100"/>
+      </w:pPr>
+      <w:r>
+        <w:rPr>
+          <w:sz w:val="21"/>
+        </w:rPr>
+        <w:t>Национальное право. Великобритания обеспечивает верховенство права, независимые суды, защиту собственности (статья 1 Протокола № 1 к Европейской конвенции по правам человека) и свободное перемещение средств без валютных ограничений. Люксембург как член ЕС гарантирует защиту собственности (статья 17 Хартии основных прав ЕС) и свободу движения капитала (статья 63 Договора о функционировании ЕС).</w:t>
+      </w:r>
+    </w:p>
+    <w:p>
+      <w:pPr>
+        <w:spacing w:after="100"/>
+      </w:pPr>
+      <w:r>
+        <w:rPr>
+          <w:sz w:val="21"/>
+        </w:rPr>
+        <w:t>Инвестиционные договоры — ключевое различие. У Великобритании есть действующий договор о взаимной защите инвестиций с Болгарией (подписан в 1995 году, в силе с 1997 года) и с Чехией (1990 год). Такой договор защищает саму инвестицию британского холдинга в болгарские компании: гарантирует возмещение при экспроприации (только в общественных целях, без дискриминации и при быстрой, адекватной и эффективной компенсации), справедливый и равный режим, свободный перевод доходов и — что особенно важно — доступ к международному инвестиционному арбитражу напрямую против государства. Люксембургский холдинг такой защиты в отношении этих стран лишён: договоры о защите инвестиций между государствами ЕС прекращены соглашением 2020 года (после решения Суда ЕС по делу Achmea), поэтому остаётся лишь защита по праву ЕС и национальному праву.</w:t>
+      </w:r>
+    </w:p>
+    <w:p>
+      <w:pPr>
+        <w:spacing w:after="100"/>
+      </w:pPr>
+      <w:r>
+        <w:rPr>
+          <w:sz w:val="21"/>
+        </w:rPr>
+        <w:t>Что следует учесть: Европейская комиссия добивается прекращения британских договоров с Болгарией и Чехией (в декабре 2024 года передала дело в Суд ЕС), поэтому их долгосрочную доступность необходимо подтвердить. Договор Великобритания — Польша прекращён в 2018 году — для возможного завода второго этапа в Польше договорной защиты нет. И Великобритания, и Люксембург участвуют в Вашингтонской конвенции (ICSID) и Нью-Йоркской конвенции 1958 года, поэтому арбитражные решения подлежат исполнению более чем в 170 странах.</w:t>
+      </w:r>
+    </w:p>
+    <w:p>
+      <w:pPr>
+        <w:spacing w:after="100"/>
+      </w:pPr>
+      <w:r>
+        <w:rPr>
+          <w:sz w:val="21"/>
+        </w:rPr>
+        <w:t>Таким образом, для защиты вложений в болгарские операционную и продающую компании британский холдинг даёт дополнительный, договорный слой защиты, которого люксембургский маршрут не обеспечивает, — ещё один довод в пользу Великобритании. Важно различать: акционерное соглашение (раздел 9) защищает инвесторов в отношениях между собой, а инвестиционный договор защищает саму инвестицию в отношениях с государством.</w:t>
       </w:r>
     </w:p>
     <w:p>
@@ -4757,6 +4826,118 @@
           </w:p>
         </w:tc>
       </w:tr>
+      <w:tr>
+        <w:tc>
+          <w:tcPr>
+            <w:tcW w:type="dxa" w:w="4873"/>
+          </w:tcPr>
+          <w:p>
+            <w:r>
+              <w:rPr>
+                <w:sz w:val="17"/>
+              </w:rPr>
+              <w:t>Защита инвестиций: Великобритания — Болгария</w:t>
+            </w:r>
+          </w:p>
+        </w:tc>
+        <w:tc>
+          <w:tcPr>
+            <w:tcW w:type="dxa" w:w="4873"/>
+          </w:tcPr>
+          <w:p>
+            <w:r>
+              <w:rPr>
+                <w:sz w:val="17"/>
+              </w:rPr>
+              <w:t>Договор о взаимной защите инвестиций 1995 года (в силе с 1997 года)</w:t>
+            </w:r>
+          </w:p>
+        </w:tc>
+      </w:tr>
+      <w:tr>
+        <w:tc>
+          <w:tcPr>
+            <w:tcW w:type="dxa" w:w="4873"/>
+          </w:tcPr>
+          <w:p>
+            <w:r>
+              <w:rPr>
+                <w:sz w:val="17"/>
+              </w:rPr>
+              <w:t>Защита инвестиций: Великобритания — Чехия</w:t>
+            </w:r>
+          </w:p>
+        </w:tc>
+        <w:tc>
+          <w:tcPr>
+            <w:tcW w:type="dxa" w:w="4873"/>
+          </w:tcPr>
+          <w:p>
+            <w:r>
+              <w:rPr>
+                <w:sz w:val="17"/>
+              </w:rPr>
+              <w:t>Договор о взаимной защите инвестиций 1990 года</w:t>
+            </w:r>
+          </w:p>
+        </w:tc>
+      </w:tr>
+      <w:tr>
+        <w:tc>
+          <w:tcPr>
+            <w:tcW w:type="dxa" w:w="4873"/>
+          </w:tcPr>
+          <w:p>
+            <w:r>
+              <w:rPr>
+                <w:sz w:val="17"/>
+              </w:rPr>
+              <w:t>Прекращение внутри-ЕС инвестдоговоров</w:t>
+            </w:r>
+          </w:p>
+        </w:tc>
+        <w:tc>
+          <w:tcPr>
+            <w:tcW w:type="dxa" w:w="4873"/>
+          </w:tcPr>
+          <w:p>
+            <w:r>
+              <w:rPr>
+                <w:sz w:val="17"/>
+              </w:rPr>
+              <w:t>Соглашение от 05.05.2020 (следствие решения Суда ЕС по делу Achmea, 2018)</w:t>
+            </w:r>
+          </w:p>
+        </w:tc>
+      </w:tr>
+      <w:tr>
+        <w:tc>
+          <w:tcPr>
+            <w:tcW w:type="dxa" w:w="4873"/>
+          </w:tcPr>
+          <w:p>
+            <w:r>
+              <w:rPr>
+                <w:sz w:val="17"/>
+              </w:rPr>
+              <w:t>Исполнение арбитражных решений</w:t>
+            </w:r>
+          </w:p>
+        </w:tc>
+        <w:tc>
+          <w:tcPr>
+            <w:tcW w:type="dxa" w:w="4873"/>
+          </w:tcPr>
+          <w:p>
+            <w:r>
+              <w:rPr>
+                <w:sz w:val="17"/>
+              </w:rPr>
+              <w:t>Вашингтонская конвенция (ICSID) 1965 года; Нью-Йоркская конвенция 1958 года</w:t>
+            </w:r>
+          </w:p>
+        </w:tc>
+      </w:tr>
     </w:tbl>
     <w:p>
       <w:pPr>

</xml_diff>

<commit_message>
Add investor->holding investment-protection leg in 2.5
- Distinguishes two legs: holding->assets (UK-Bulgaria/Czech BITs) and
  investor->holding (home-state to UK/Lux BIT). UK-UAE BIT (1992, in force 1993);
  BLEU(Belgium-Luxembourg)-UAE (2004) and -Saudi Arabia (2001); notes modest
  practical weight (low UK/Lux expropriation risk), intra-EU/US caveats
- Appendix example row added; TOC page numbers updated (now 20 pages)

https://claude.ai/code/session_01JTbBsiSWXRS1fuAGFXnjiU
</commit_message>
<xml_diff>
--- a/STRIKER_Structure_Memorandum_RU.docx
+++ b/STRIKER_Structure_Memorandum_RU.docx
@@ -1557,7 +1557,18 @@
         <w:rPr>
           <w:sz w:val="21"/>
         </w:rPr>
-        <w:t>Инвестиционные договоры — ключевое различие. У Великобритании есть действующий договор о взаимной защите инвестиций с Болгарией (подписан в 1995 году, в силе с 1997 года) и с Чехией (1990 год). Такой договор защищает саму инвестицию британского холдинга в болгарские компании: гарантирует возмещение при экспроприации (только в общественных целях, без дискриминации и при быстрой, адекватной и эффективной компенсации), справедливый и равный режим, свободный перевод доходов и — что особенно важно — доступ к международному инвестиционному арбитражу напрямую против государства. Люксембургский холдинг такой защиты в отношении этих стран лишён: договоры о защите инвестиций между государствами ЕС прекращены соглашением 2020 года (после решения Суда ЕС по делу Achmea), поэтому остаётся лишь защита по праву ЕС и национальному праву.</w:t>
+        <w:t>Инвестиционные договоры — ключевое различие. На уровне «холдинг → активы» у Великобритании есть действующий договор о взаимной защите инвестиций с Болгарией (подписан в 1995 году, в силе с 1997 года) и с Чехией (1990 год). Такой договор защищает саму инвестицию британского холдинга в болгарские компании: гарантирует возмещение при экспроприации (только в общественных целях, без дискриминации и при быстрой, адекватной и эффективной компенсации), справедливый и равный режим, свободный перевод доходов и — что особенно важно — доступ к международному инвестиционному арбитражу напрямую против государства. Люксембургский холдинг такой защиты в отношении этих стран лишён: договоры о защите инвестиций между государствами ЕС прекращены соглашением 2020 года (после решения Суда ЕС по делу Achmea), поэтому остаётся лишь защита по праву ЕС и национальному праву.</w:t>
+      </w:r>
+    </w:p>
+    <w:p>
+      <w:pPr>
+        <w:spacing w:after="100"/>
+      </w:pPr>
+      <w:r>
+        <w:rPr>
+          <w:sz w:val="21"/>
+        </w:rPr>
+        <w:t>Защита на уровне «инвестор → холдинг» работает по другому договору — между страной инвестора и страной холдинга — и защищает долю инвестора в самом холдинге. И Великобритания, и Люксембург имеют такие договоры с ключевыми странами Залива: Великобритания — с ОАЭ (1992, в силе с 1993 года); Люксембург через экономический союз с Бельгией (BLEU) — с ОАЭ (2004) и Саудовской Аравией (2001), а также широкую сеть с другими странами. Практическое значение этого слоя умеренное: вероятность экспроприации со стороны самих Великобритании или Люксембурга крайне мала, поэтому договор здесь главным образом гарантирует свободный перевод средств и даёт опцию международного арбитража. Конкретное покрытие зависит от страны инвестора: для инвесторов из ЕС в люксембургский холдинг договорной защиты нет (внутренний для ЕС случай), а инвесторы из США полагаются на надёжность правовой системы, поскольку договора о защите инвестиций с Великобританией и Люксембургом у США нет.</w:t>
       </w:r>
     </w:p>
     <w:p>
@@ -4920,6 +4931,34 @@
               <w:rPr>
                 <w:sz w:val="17"/>
               </w:rPr>
+              <w:t>Защита инвестор → холдинг (примеры)</w:t>
+            </w:r>
+          </w:p>
+        </w:tc>
+        <w:tc>
+          <w:tcPr>
+            <w:tcW w:type="dxa" w:w="4873"/>
+          </w:tcPr>
+          <w:p>
+            <w:r>
+              <w:rPr>
+                <w:sz w:val="17"/>
+              </w:rPr>
+              <w:t>Великобритания—ОАЭ (1992, в силе с 1993); BLEU (Бельгия-Люксембург)—ОАЭ (2004), —Саудовская Аравия (2001)</w:t>
+            </w:r>
+          </w:p>
+        </w:tc>
+      </w:tr>
+      <w:tr>
+        <w:tc>
+          <w:tcPr>
+            <w:tcW w:type="dxa" w:w="4873"/>
+          </w:tcPr>
+          <w:p>
+            <w:r>
+              <w:rPr>
+                <w:sz w:val="17"/>
+              </w:rPr>
               <w:t>Исполнение арбитражных решений</w:t>
             </w:r>
           </w:p>

</xml_diff>